<commit_message>
adds discussion on uses of hazelnuts to Hunters Moon Chapter
</commit_message>
<xml_diff>
--- a/Content/Arrangement/1.5 - AWonkaBeastFierceAndTerrible.docx
+++ b/Content/Arrangement/1.5 - AWonkaBeastFierceAndTerrible.docx
@@ -42,23 +42,7 @@
         <w:t>th</w:t>
       </w:r>
       <w:r>
-        <w:t xml:space="preserve"> Confederate </w:t>
-      </w:r>
-      <w:proofErr w:type="spellStart"/>
-      <w:r>
-        <w:t>Exhibitionary</w:t>
-      </w:r>
-      <w:proofErr w:type="spellEnd"/>
-      <w:r>
-        <w:t xml:space="preserve"> Unit, or </w:t>
-      </w:r>
-      <w:proofErr w:type="spellStart"/>
-      <w:r>
-        <w:t>marnie’s</w:t>
-      </w:r>
-      <w:proofErr w:type="spellEnd"/>
-      <w:r>
-        <w:t xml:space="preserve"> witches – it was common for them to bring their children with them. Buford was certain that Wes would find playmates among them.</w:t>
+        <w:t xml:space="preserve"> Confederate Exhibitionary Unit, or marnie’s witches – it was common for them to bring their children with them. Buford was certain that Wes would find playmates among them.</w:t>
       </w:r>
     </w:p>
     <w:p>
@@ -69,20 +53,10 @@
         <w:t>Wes had an abrasive</w:t>
       </w:r>
       <w:r>
-        <w:t xml:space="preserve"> </w:t>
-      </w:r>
-      <w:proofErr w:type="spellStart"/>
-      <w:proofErr w:type="gramStart"/>
-      <w:r>
-        <w:t>affect</w:t>
-      </w:r>
-      <w:proofErr w:type="spellEnd"/>
-      <w:proofErr w:type="gramEnd"/>
-      <w:r>
-        <w:t xml:space="preserve"> on the other children. </w:t>
-      </w:r>
-      <w:r>
-        <w:t>The presence of other children only produced friction and parents found themselves constantly remediating conflicts. They stopped bringing their children altogether.</w:t>
+        <w:t xml:space="preserve"> affect on the other children. </w:t>
+      </w:r>
+      <w:r>
+        <w:t>The presence of other children only produced friction and parents found themselves constantly mediating conflicts. They stopped bringing their children altogether.</w:t>
       </w:r>
     </w:p>
     <w:p>
@@ -182,23 +156,7 @@
         <w:t>“Well, tell Ferdinand</w:t>
       </w:r>
       <w:r>
-        <w:t xml:space="preserve"> </w:t>
-      </w:r>
-      <w:proofErr w:type="spellStart"/>
-      <w:r>
-        <w:t>ya</w:t>
-      </w:r>
-      <w:proofErr w:type="spellEnd"/>
-      <w:r>
-        <w:t xml:space="preserve"> da </w:t>
-      </w:r>
-      <w:proofErr w:type="spellStart"/>
-      <w:r>
-        <w:t>yaa</w:t>
-      </w:r>
-      <w:proofErr w:type="spellEnd"/>
-      <w:r>
-        <w:t>.”</w:t>
+        <w:t xml:space="preserve"> ya da yaa.”</w:t>
       </w:r>
     </w:p>
     <w:p>
@@ -255,36 +213,12 @@
     </w:p>
     <w:p>
       <w:r>
-        <w:t xml:space="preserve">Buford </w:t>
-      </w:r>
-      <w:proofErr w:type="gramStart"/>
-      <w:r>
-        <w:t>made an attempt</w:t>
-      </w:r>
-      <w:proofErr w:type="gramEnd"/>
-      <w:r>
-        <w:t xml:space="preserve"> to join Wes in his game.</w:t>
-      </w:r>
-    </w:p>
-    <w:p>
-      <w:r>
-        <w:t xml:space="preserve">He found Wes in his room lying in his bed with a game controller. His attention was fixed on a wall-mounted screen, where Wes, digitally represented by a knight, was engaged in furious battle with </w:t>
-      </w:r>
-      <w:proofErr w:type="spellStart"/>
-      <w:r>
-        <w:t>jowley</w:t>
-      </w:r>
-      <w:proofErr w:type="spellEnd"/>
-      <w:r>
-        <w:t xml:space="preserve"> tusked monster. Digital Wes was </w:t>
-      </w:r>
-      <w:proofErr w:type="gramStart"/>
-      <w:r>
-        <w:t>defeated</w:t>
-      </w:r>
-      <w:proofErr w:type="gramEnd"/>
-      <w:r>
-        <w:t xml:space="preserve"> and the monster strutted and gloated over his inert form.</w:t>
+        <w:t>Buford made an attempt to join Wes in his game.</w:t>
+      </w:r>
+    </w:p>
+    <w:p>
+      <w:r>
+        <w:t>He found Wes in his room lying in his bed with a game controller. His attention was fixed on a wall-mounted screen, where Wes, digitally represented by a knight, was engaged in furious battle with jowley tusked monster. Digital Wes was defeated and the monster strutted and gloated over his inert form.</w:t>
       </w:r>
     </w:p>
     <w:p>
@@ -312,15 +246,7 @@
     </w:p>
     <w:p>
       <w:r>
-        <w:t>“</w:t>
-      </w:r>
-      <w:proofErr w:type="spellStart"/>
-      <w:r>
-        <w:t>Whacha</w:t>
-      </w:r>
-      <w:proofErr w:type="spellEnd"/>
-      <w:r>
-        <w:t xml:space="preserve"> playing?” he asked.</w:t>
+        <w:t>“Whacha playing?” he asked.</w:t>
       </w:r>
     </w:p>
     <w:p>
@@ -374,15 +300,7 @@
     </w:p>
     <w:p>
       <w:r>
-        <w:t xml:space="preserve">Wes took a comic book and left the room. He brushed past Buford’s wife, </w:t>
-      </w:r>
-      <w:proofErr w:type="gramStart"/>
-      <w:r>
-        <w:t>Claire</w:t>
-      </w:r>
-      <w:proofErr w:type="gramEnd"/>
-      <w:r>
-        <w:t xml:space="preserve"> who was watching from the hallway.</w:t>
+        <w:t>Wes took a comic book and left the room. He brushed past Buford’s wife, Claire who was watching from the hallway.</w:t>
       </w:r>
     </w:p>
     <w:p>
@@ -410,36 +328,12 @@
     </w:p>
     <w:p>
       <w:r>
-        <w:t xml:space="preserve">Some </w:t>
-      </w:r>
-      <w:proofErr w:type="gramStart"/>
-      <w:r>
-        <w:t>conversation</w:t>
-      </w:r>
-      <w:proofErr w:type="gramEnd"/>
-      <w:r>
-        <w:t xml:space="preserve"> here about Wes and Buford’s relationship. A reference to ‘the thing with the turkeys.’</w:t>
-      </w:r>
-    </w:p>
-    <w:p>
-      <w:r>
-        <w:t xml:space="preserve">Later that night, Buford and </w:t>
-      </w:r>
-      <w:proofErr w:type="gramStart"/>
-      <w:r>
-        <w:t>Clair</w:t>
-      </w:r>
-      <w:proofErr w:type="gramEnd"/>
-      <w:r>
-        <w:t xml:space="preserve"> asleep. Wes </w:t>
-      </w:r>
-      <w:proofErr w:type="gramStart"/>
-      <w:r>
-        <w:t>awake</w:t>
-      </w:r>
-      <w:proofErr w:type="gramEnd"/>
-      <w:r>
-        <w:t xml:space="preserve">. </w:t>
+        <w:t>Some conversation here about Wes and Buford’s relationship. A reference to ‘the thing with the turkeys.’</w:t>
+      </w:r>
+    </w:p>
+    <w:p>
+      <w:r>
+        <w:t xml:space="preserve">Later that night, Buford and Clair asleep. Wes awake. </w:t>
       </w:r>
     </w:p>
     <w:p/>
@@ -447,15 +341,7 @@
     <w:p>
       <w:r>
         <w:lastRenderedPageBreak/>
-        <w:t xml:space="preserve">Late that night, Buford and Clair lay asleep at the other end of the hall. Wesley lay awake, mesmerized before the screen. He had found at last the enchanted weapon he </w:t>
-      </w:r>
-      <w:proofErr w:type="gramStart"/>
-      <w:r>
-        <w:t>needed  was</w:t>
-      </w:r>
-      <w:proofErr w:type="gramEnd"/>
-      <w:r>
-        <w:t xml:space="preserve"> on the verge of conquering the great tusked creature under whose claws he had endured death after death.</w:t>
+        <w:t>Late that night, Buford and Clair lay asleep at the other end of the hall. Wesley lay awake, mesmerized before the screen. He had found at last the enchanted weapon he needed  was on the verge of conquering the great tusked creature under whose claws he had endured death after death.</w:t>
       </w:r>
     </w:p>
     <w:p>
@@ -485,15 +371,7 @@
     </w:p>
     <w:p>
       <w:r>
-        <w:t>“Oh, jeez. I’ve told you a thousand times</w:t>
-      </w:r>
-      <w:proofErr w:type="gramStart"/>
-      <w:r>
-        <w:t xml:space="preserve"> ..</w:t>
-      </w:r>
-      <w:proofErr w:type="gramEnd"/>
-      <w:r>
-        <w:t>”</w:t>
+        <w:t>“Oh, jeez. I’ve told you a thousand times ..”</w:t>
       </w:r>
     </w:p>
     <w:p>
@@ -509,23 +387,7 @@
     </w:p>
     <w:p>
       <w:r>
-        <w:t xml:space="preserve">The wire-crested pileated pea snipe </w:t>
-      </w:r>
-      <w:proofErr w:type="gramStart"/>
-      <w:r>
-        <w:t>were</w:t>
-      </w:r>
-      <w:proofErr w:type="gramEnd"/>
-      <w:r>
-        <w:t xml:space="preserve"> an invention of Mosey’s family going back generations. Nobody knows who invented them. Wesley had been dispatched in search of </w:t>
-      </w:r>
-      <w:proofErr w:type="gramStart"/>
-      <w:r>
-        <w:t>them when</w:t>
-      </w:r>
-      <w:proofErr w:type="gramEnd"/>
-      <w:r>
-        <w:t xml:space="preserve"> early in his childhood, as had Buford and each of his siblings. Mosey herself and perhaps even Mosey’s mother and beyond.</w:t>
+        <w:t>The wire-crested pileated pea snipe were an invention of Mosey’s family going back generations. Nobody knows who invented them. Wesley had been dispatched in search of them when early in his childhood, as had Buford and each of his siblings. Mosey herself and perhaps even Mosey’s mother and beyond.</w:t>
       </w:r>
     </w:p>
     <w:p>
@@ -551,65 +413,23 @@
     </w:p>
     <w:p>
       <w:r>
-        <w:t xml:space="preserve">There had been a period when Wes was younger when his dad had kept turkeys on the farm. </w:t>
-      </w:r>
-      <w:proofErr w:type="gramStart"/>
-      <w:r>
-        <w:t>A gentlemen</w:t>
-      </w:r>
-      <w:proofErr w:type="gramEnd"/>
-      <w:r>
-        <w:t xml:space="preserve"> farmer. They delighted all, including Wes. In those days, Wes enjoyed the farm. He was glad for the company of the animals and was glad they talked to him. The adults didn’t think it at all odd that he conversed with the animals and found it adorable that he did so and relayed information from the animals to the </w:t>
-      </w:r>
-      <w:proofErr w:type="spellStart"/>
-      <w:proofErr w:type="gramStart"/>
-      <w:r>
-        <w:t>grown ups</w:t>
-      </w:r>
-      <w:proofErr w:type="spellEnd"/>
-      <w:proofErr w:type="gramEnd"/>
-      <w:r>
-        <w:t>., translated the clucking of the hens into verse.</w:t>
-      </w:r>
-    </w:p>
-    <w:p>
-      <w:r>
-        <w:t xml:space="preserve">As he grew, the </w:t>
-      </w:r>
-      <w:proofErr w:type="spellStart"/>
-      <w:r>
-        <w:t>grown ups</w:t>
-      </w:r>
-      <w:proofErr w:type="spellEnd"/>
-      <w:r>
-        <w:t xml:space="preserve"> attitude switched from delight to concern. Wes was sent to Nashvanooga where he consulted with friendly strangers where they invited him to play with toys and draw pictures. Wes himself became uncomfortable not that he could converse with the animals but that others could not. He learned to discretion.</w:t>
-      </w:r>
-    </w:p>
-    <w:p>
-      <w:r>
-        <w:t xml:space="preserve">He did not give them names, except one. The smallest became known as Gretchen and was more curious than the rest and yada </w:t>
-      </w:r>
-      <w:proofErr w:type="spellStart"/>
-      <w:r>
-        <w:t>yada</w:t>
-      </w:r>
-      <w:proofErr w:type="spellEnd"/>
-      <w:r>
-        <w:t>.</w:t>
+        <w:t>There had been a period when Wes was younger when his dad had kept turkeys on the farm. A gentlemen farmer. They delighted all, including Wes. In those days, Wes enjoyed the farm. He was glad for the company of the animals and was glad they talked to him. The adults didn’t think it at all odd that he conversed with the animals and found it adorable that he did so and relayed information from the animals to the grown ups., translated the clucking of the hens into verse.</w:t>
+      </w:r>
+    </w:p>
+    <w:p>
+      <w:r>
+        <w:t>As he grew, the grown ups attitude switched from delight to concern. Wes was sent to Nashvanooga where he consulted with friendly strangers where they invited him to play with toys and draw pictures. Wes himself became uncomfortable not that he could converse with the animals but that others could not. He learned to discretion.</w:t>
+      </w:r>
+    </w:p>
+    <w:p>
+      <w:r>
+        <w:t>He did not give them names, except one. The smallest became known as Gretchen and was more curious than the rest and yada yada.</w:t>
       </w:r>
     </w:p>
     <w:p>
       <w:r>
         <w:lastRenderedPageBreak/>
-        <w:t xml:space="preserve">It came time to slaughter them. A bloody and violent business, but the gentleman farmer from the </w:t>
-      </w:r>
-      <w:proofErr w:type="spellStart"/>
-      <w:r>
-        <w:t>hobbiest</w:t>
-      </w:r>
-      <w:proofErr w:type="spellEnd"/>
-      <w:r>
-        <w:t>. Wes was present on the farm and entrusted Beatrice to keep Wes occupied while the slaughter, a bloody and violent business, was competed.</w:t>
+        <w:t>It came time to slaughter them. A bloody and violent business, but the gentleman farmer from the hobbiest. Wes was present on the farm and entrusted Beatrice to keep Wes occupied while the slaughter, a bloody and violent business, was competed.</w:t>
       </w:r>
     </w:p>
     <w:p>
@@ -637,36 +457,12 @@
     </w:p>
     <w:p>
       <w:r>
-        <w:t xml:space="preserve">But tonight, Wes was intrigued. Grimwalt had never reported </w:t>
-      </w:r>
-      <w:proofErr w:type="gramStart"/>
-      <w:r>
-        <w:t>actually seeing</w:t>
-      </w:r>
-      <w:proofErr w:type="gramEnd"/>
-      <w:r>
-        <w:t xml:space="preserve"> one, and given the mystery of the orchard, Wes was compelled. Wesley put on a pair of jeans and a flannel shirt. He crept down the stairs and silently exited the farmhouse under a bulbous orange full moon.</w:t>
-      </w:r>
-    </w:p>
-    <w:p>
-      <w:r>
-        <w:t xml:space="preserve">It </w:t>
-      </w:r>
-      <w:proofErr w:type="gramStart"/>
-      <w:r>
-        <w:t>uncommonly</w:t>
-      </w:r>
-      <w:proofErr w:type="gramEnd"/>
-      <w:r>
-        <w:t xml:space="preserve"> </w:t>
-      </w:r>
-      <w:proofErr w:type="gramStart"/>
-      <w:r>
-        <w:t>warm</w:t>
-      </w:r>
-      <w:proofErr w:type="gramEnd"/>
-      <w:r>
-        <w:t xml:space="preserve"> for an October night. </w:t>
+        <w:t>But tonight, Wes was intrigued. Grimwalt had never reported actually seeing one, and given the mystery of the orchard, Wes was compelled. Wesley put on a pair of jeans and a flannel shirt. He crept down the stairs and silently exited the farmhouse under a bulbous orange full moon.</w:t>
+      </w:r>
+    </w:p>
+    <w:p>
+      <w:r>
+        <w:t xml:space="preserve">It uncommonly warm for an October night. </w:t>
       </w:r>
     </w:p>
     <w:p>
@@ -723,23 +519,7 @@
     </w:p>
     <w:p>
       <w:r>
-        <w:t xml:space="preserve">Wes examined the area where Bandigo had been digging. He found in the dirt a roundish item that was about the size of a walnut but pale in color. Wes examined it. It appeared to be a sort of stemless mushroom. </w:t>
-      </w:r>
-      <w:proofErr w:type="gramStart"/>
-      <w:r>
-        <w:t>It’s</w:t>
-      </w:r>
-      <w:proofErr w:type="gramEnd"/>
-      <w:r>
-        <w:t xml:space="preserve"> gave a smell that was pungent and pleasing. It reminded Wes of </w:t>
-      </w:r>
-      <w:proofErr w:type="spellStart"/>
-      <w:r>
-        <w:t>bullion</w:t>
-      </w:r>
-      <w:proofErr w:type="spellEnd"/>
-      <w:r>
-        <w:t xml:space="preserve"> cubes and raisins. Wes could see how such a scent could send the dogs into a frenzy.</w:t>
+        <w:t>Wes examined the area where Bandigo had been digging. He found in the dirt a roundish item that was about the size of a walnut but pale in color. Wes examined it. It appeared to be a sort of stemless mushroom. It’s gave a smell that was pungent and pleasing. It reminded Wes of bullion cubes and raisins. Wes could see how such a scent could send the dogs into a frenzy.</w:t>
       </w:r>
     </w:p>
     <w:p/>
@@ -750,76 +530,12 @@
     </w:p>
     <w:p>
       <w:r>
-        <w:t xml:space="preserve">Though the full moon had </w:t>
-      </w:r>
-      <w:proofErr w:type="gramStart"/>
-      <w:r>
-        <w:t>lighted</w:t>
-      </w:r>
-      <w:proofErr w:type="gramEnd"/>
-      <w:r>
-        <w:t xml:space="preserve"> the meadow to a near daylight level, here in the shadow of the orchard it was difficult at first for Wes to see what was happening. Then he realized that the larger animal was Marnie’s pig, Ferdinand.</w:t>
-      </w:r>
-    </w:p>
-    <w:p>
-      <w:r>
-        <w:t xml:space="preserve">You might think of a pig as a </w:t>
-      </w:r>
-      <w:proofErr w:type="gramStart"/>
-      <w:r>
-        <w:t>comical animals</w:t>
-      </w:r>
-      <w:proofErr w:type="gramEnd"/>
-      <w:r>
-        <w:t xml:space="preserve">, fat but fights between dogs and pigs are serious affairs. Amont some in these mountains, it is </w:t>
-      </w:r>
-      <w:proofErr w:type="gramStart"/>
-      <w:r>
-        <w:t>sport</w:t>
-      </w:r>
-      <w:proofErr w:type="gramEnd"/>
-      <w:r>
-        <w:t xml:space="preserve"> to set dogs on wild boars that roam in </w:t>
-      </w:r>
-      <w:proofErr w:type="spellStart"/>
-      <w:r>
-        <w:t>abundate</w:t>
-      </w:r>
-      <w:proofErr w:type="spellEnd"/>
-      <w:r>
-        <w:t xml:space="preserve"> and such </w:t>
-      </w:r>
-      <w:proofErr w:type="gramStart"/>
-      <w:r>
-        <w:t>encounters,</w:t>
-      </w:r>
-      <w:proofErr w:type="gramEnd"/>
-      <w:r>
-        <w:t xml:space="preserve"> usually go in the dog’s favor, who have advantage in number and the wild boars much smaller. But not always. Boars have fierce tusks and great strength in their necks and wild boar </w:t>
-      </w:r>
-      <w:proofErr w:type="gramStart"/>
-      <w:r>
-        <w:t>hunters</w:t>
-      </w:r>
-      <w:proofErr w:type="gramEnd"/>
-      <w:r>
-        <w:t xml:space="preserve"> tales of brave hounds lay entrails streaming. Ferdinand, an </w:t>
-      </w:r>
-      <w:proofErr w:type="spellStart"/>
-      <w:r>
-        <w:t>unnutered</w:t>
-      </w:r>
-      <w:proofErr w:type="spellEnd"/>
-      <w:r>
-        <w:t xml:space="preserve"> male, had formidable tusks and was much larger than the wild boars that roamed these mountains in the wild. Grimwalt was a dog past his prime. A Wonka Beast, he </w:t>
-      </w:r>
-      <w:proofErr w:type="gramStart"/>
-      <w:r>
-        <w:t>was,</w:t>
-      </w:r>
-      <w:proofErr w:type="gramEnd"/>
-      <w:r>
-        <w:t xml:space="preserve"> fierce and terrible.</w:t>
+        <w:t>Though the full moon had lighted the meadow to a near daylight level, here in the shadow of the orchard it was difficult at first for Wes to see what was happening. Then he realized that the larger animal was Marnie’s pig, Ferdinand.</w:t>
+      </w:r>
+    </w:p>
+    <w:p>
+      <w:r>
+        <w:t>You might think of a pig as a comical animals, fat but fights between dogs and pigs are serious affairs. Amont some in these mountains, it is sport to set dogs on wild boars that roam in abundate and such encounters, usually go in the dog’s favor, who have advantage in number and the wild boars much smaller. But not always. Boars have fierce tusks and great strength in their necks and wild boar hunters tales of brave hounds lay entrails streaming. Ferdinand, an unnutered male, had formidable tusks and was much larger than the wild boars that roamed these mountains in the wild. Grimwalt was a dog past his prime. A Wonka Beast, he was, fierce and terrible.</w:t>
       </w:r>
     </w:p>
     <w:p>
@@ -834,15 +550,7 @@
     </w:p>
     <w:p>
       <w:r>
-        <w:t xml:space="preserve">Fierce snarling. Guttural grunts. </w:t>
-      </w:r>
-      <w:proofErr w:type="spellStart"/>
-      <w:r>
-        <w:t>Gimwalt</w:t>
-      </w:r>
-      <w:proofErr w:type="spellEnd"/>
-      <w:r>
-        <w:t xml:space="preserve"> lay writhing and wailing on the ground.</w:t>
+        <w:t>Fierce snarling. Guttural grunts. Gimwalt lay writhing and wailing on the ground.</w:t>
       </w:r>
     </w:p>
     <w:p>
@@ -852,15 +560,7 @@
     </w:p>
     <w:p>
       <w:r>
-        <w:t xml:space="preserve">Wes turned to do just that. When he did, he ran square into Marnie. She carried a shovel and a large </w:t>
-      </w:r>
-      <w:proofErr w:type="spellStart"/>
-      <w:r>
-        <w:t>whicker</w:t>
-      </w:r>
-      <w:proofErr w:type="spellEnd"/>
-      <w:r>
-        <w:t xml:space="preserve"> basket.</w:t>
+        <w:t>Wes turned to do just that. When he did, he ran square into Marnie. She carried a shovel and a large whicker basket.</w:t>
       </w:r>
     </w:p>
     <w:p>
@@ -875,49 +575,17 @@
     </w:p>
     <w:p>
       <w:r>
-        <w:t xml:space="preserve">Marnie examined her pig and found him uninjured. Grimwalt was </w:t>
-      </w:r>
-      <w:proofErr w:type="gramStart"/>
-      <w:r>
-        <w:t>lucky in</w:t>
-      </w:r>
-      <w:proofErr w:type="gramEnd"/>
-      <w:r>
-        <w:t xml:space="preserve"> that the gash he received was </w:t>
-      </w:r>
-      <w:proofErr w:type="gramStart"/>
-      <w:r>
-        <w:t>in</w:t>
-      </w:r>
-      <w:proofErr w:type="gramEnd"/>
-      <w:r>
-        <w:t xml:space="preserve"> his shoulder and not his abdomen.</w:t>
-      </w:r>
-    </w:p>
-    <w:p>
-      <w:r>
-        <w:t xml:space="preserve">“This </w:t>
-      </w:r>
-      <w:proofErr w:type="spellStart"/>
-      <w:r>
-        <w:t>dog’ll</w:t>
-      </w:r>
-      <w:proofErr w:type="spellEnd"/>
-      <w:r>
-        <w:t xml:space="preserve"> be okay. He’ll need stitches. A lot of them. Go wake your dad.</w:t>
-      </w:r>
-    </w:p>
-    <w:p>
-      <w:r>
-        <w:t xml:space="preserve">“Wesley,” she said. “This orchard and what’s in it </w:t>
-      </w:r>
-      <w:proofErr w:type="gramStart"/>
-      <w:r>
-        <w:t>is</w:t>
-      </w:r>
-      <w:proofErr w:type="gramEnd"/>
-      <w:r>
-        <w:t xml:space="preserve"> mine. You stay out of it.”</w:t>
+        <w:t>Marnie examined her pig and found him uninjured. Grimwalt was lucky in that the gash he received was in his shoulder and not his abdomen.</w:t>
+      </w:r>
+    </w:p>
+    <w:p>
+      <w:r>
+        <w:t>“This dog’ll be okay. He’ll need stitches. A lot of them. Go wake your dad.</w:t>
+      </w:r>
+    </w:p>
+    <w:p>
+      <w:r>
+        <w:t>“Wesley,” she said. “This orchard and what’s in it is mine. You stay out of it.”</w:t>
       </w:r>
     </w:p>
     <w:p/>
@@ -939,44 +607,12 @@
     </w:p>
     <w:p>
       <w:r>
-        <w:t xml:space="preserve">“Up to her toil and troubling, I guess. Up there scrounging </w:t>
-      </w:r>
-      <w:proofErr w:type="gramStart"/>
-      <w:r>
-        <w:t>for  bat</w:t>
-      </w:r>
-      <w:proofErr w:type="gramEnd"/>
-      <w:r>
-        <w:t xml:space="preserve"> </w:t>
-      </w:r>
-      <w:proofErr w:type="spellStart"/>
-      <w:r>
-        <w:t>toungues</w:t>
-      </w:r>
-      <w:proofErr w:type="spellEnd"/>
-      <w:r>
-        <w:t xml:space="preserve"> and frog toes. </w:t>
-      </w:r>
-    </w:p>
-    <w:p>
-      <w:r>
-        <w:t xml:space="preserve">For the next two nights, the dogs saw </w:t>
-      </w:r>
-      <w:proofErr w:type="gramStart"/>
-      <w:r>
-        <w:t>the</w:t>
-      </w:r>
-      <w:proofErr w:type="gramEnd"/>
-      <w:r>
-        <w:t xml:space="preserve"> could see the wire crested pea snipes along the edge of the forest and were consumed with a desire to pursue them. They could smell Marnie and Ferdinand in the orchard as well. After two nights, the full moon </w:t>
-      </w:r>
-      <w:proofErr w:type="gramStart"/>
-      <w:r>
-        <w:t>waned</w:t>
-      </w:r>
-      <w:proofErr w:type="gramEnd"/>
-      <w:r>
-        <w:t xml:space="preserve"> and the wire-crested pea snipe were </w:t>
+        <w:t xml:space="preserve">“Up to her toil and troubling, I guess. Up there scrounging for  bat toungues and frog toes. </w:t>
+      </w:r>
+    </w:p>
+    <w:p>
+      <w:r>
+        <w:t xml:space="preserve">For the next two nights, the dogs saw the could see the wire crested pea snipes along the edge of the forest and were consumed with a desire to pursue them. They could smell Marnie and Ferdinand in the orchard as well. After two nights, the full moon waned and the wire-crested pea snipe were </w:t>
       </w:r>
       <w:r>
         <w:t>gone</w:t>

</xml_diff>

<commit_message>
Lots of work on Pileated Pea Snipe chapter
</commit_message>
<xml_diff>
--- a/Content/Arrangement/1.5 - AWonkaBeastFierceAndTerrible.docx
+++ b/Content/Arrangement/1.5 - AWonkaBeastFierceAndTerrible.docx
@@ -42,7 +42,23 @@
         <w:t>th</w:t>
       </w:r>
       <w:r>
-        <w:t xml:space="preserve"> Confederate Exhibitionary Unit, or marnie’s witches – it was common for them to bring their children with them. Buford was certain that Wes would find playmates among them.</w:t>
+        <w:t xml:space="preserve"> Confederate </w:t>
+      </w:r>
+      <w:proofErr w:type="spellStart"/>
+      <w:r>
+        <w:t>Exhibitionary</w:t>
+      </w:r>
+      <w:proofErr w:type="spellEnd"/>
+      <w:r>
+        <w:t xml:space="preserve"> Unit, or </w:t>
+      </w:r>
+      <w:proofErr w:type="spellStart"/>
+      <w:r>
+        <w:t>marnie’s</w:t>
+      </w:r>
+      <w:proofErr w:type="spellEnd"/>
+      <w:r>
+        <w:t xml:space="preserve"> witches – it was common for them to bring their children with them. Buford was certain that Wes would find playmates among them.</w:t>
       </w:r>
     </w:p>
     <w:p>
@@ -53,7 +69,17 @@
         <w:t>Wes had an abrasive</w:t>
       </w:r>
       <w:r>
-        <w:t xml:space="preserve"> affect on the other children. </w:t>
+        <w:t xml:space="preserve"> </w:t>
+      </w:r>
+      <w:proofErr w:type="spellStart"/>
+      <w:proofErr w:type="gramStart"/>
+      <w:r>
+        <w:t>affect</w:t>
+      </w:r>
+      <w:proofErr w:type="spellEnd"/>
+      <w:proofErr w:type="gramEnd"/>
+      <w:r>
+        <w:t xml:space="preserve"> on the other children. </w:t>
       </w:r>
       <w:r>
         <w:t>The presence of other children only produced friction and parents found themselves constantly mediating conflicts. They stopped bringing their children altogether.</w:t>
@@ -156,7 +182,23 @@
         <w:t>“Well, tell Ferdinand</w:t>
       </w:r>
       <w:r>
-        <w:t xml:space="preserve"> ya da yaa.”</w:t>
+        <w:t xml:space="preserve"> </w:t>
+      </w:r>
+      <w:proofErr w:type="spellStart"/>
+      <w:r>
+        <w:t>ya</w:t>
+      </w:r>
+      <w:proofErr w:type="spellEnd"/>
+      <w:r>
+        <w:t xml:space="preserve"> da </w:t>
+      </w:r>
+      <w:proofErr w:type="spellStart"/>
+      <w:r>
+        <w:t>yaa</w:t>
+      </w:r>
+      <w:proofErr w:type="spellEnd"/>
+      <w:r>
+        <w:t>.”</w:t>
       </w:r>
     </w:p>
     <w:p>
@@ -213,12 +255,28 @@
     </w:p>
     <w:p>
       <w:r>
-        <w:t>Buford made an attempt to join Wes in his game.</w:t>
-      </w:r>
-    </w:p>
-    <w:p>
-      <w:r>
-        <w:t>He found Wes in his room lying in his bed with a game controller. His attention was fixed on a wall-mounted screen, where Wes, digitally represented by a knight, was engaged in furious battle with jowley tusked monster. Digital Wes was defeated and the monster strutted and gloated over his inert form.</w:t>
+        <w:t xml:space="preserve">Buford </w:t>
+      </w:r>
+      <w:proofErr w:type="gramStart"/>
+      <w:r>
+        <w:t>made an attempt</w:t>
+      </w:r>
+      <w:proofErr w:type="gramEnd"/>
+      <w:r>
+        <w:t xml:space="preserve"> to join Wes in his game.</w:t>
+      </w:r>
+    </w:p>
+    <w:p>
+      <w:r>
+        <w:t xml:space="preserve">He found Wes in his room lying in his bed with a game controller. His attention was fixed on a wall-mounted screen, where Wes, digitally represented by a knight, was engaged in furious battle with </w:t>
+      </w:r>
+      <w:proofErr w:type="spellStart"/>
+      <w:r>
+        <w:t>jowley</w:t>
+      </w:r>
+      <w:proofErr w:type="spellEnd"/>
+      <w:r>
+        <w:t xml:space="preserve"> tusked monster. Digital Wes was defeated and the monster strutted and gloated over his inert form.</w:t>
       </w:r>
     </w:p>
     <w:p>
@@ -246,7 +304,15 @@
     </w:p>
     <w:p>
       <w:r>
-        <w:t>“Whacha playing?” he asked.</w:t>
+        <w:t>“</w:t>
+      </w:r>
+      <w:proofErr w:type="spellStart"/>
+      <w:r>
+        <w:t>Whacha</w:t>
+      </w:r>
+      <w:proofErr w:type="spellEnd"/>
+      <w:r>
+        <w:t xml:space="preserve"> playing?” he asked.</w:t>
       </w:r>
     </w:p>
     <w:p>
@@ -300,7 +366,15 @@
     </w:p>
     <w:p>
       <w:r>
-        <w:t>Wes took a comic book and left the room. He brushed past Buford’s wife, Claire who was watching from the hallway.</w:t>
+        <w:t xml:space="preserve">Wes took a comic book and left the room. He brushed past Buford’s wife, </w:t>
+      </w:r>
+      <w:proofErr w:type="gramStart"/>
+      <w:r>
+        <w:t>Claire</w:t>
+      </w:r>
+      <w:proofErr w:type="gramEnd"/>
+      <w:r>
+        <w:t xml:space="preserve"> who was watching from the hallway.</w:t>
       </w:r>
     </w:p>
     <w:p>
@@ -328,12 +402,36 @@
     </w:p>
     <w:p>
       <w:r>
-        <w:t>Some conversation here about Wes and Buford’s relationship. A reference to ‘the thing with the turkeys.’</w:t>
-      </w:r>
-    </w:p>
-    <w:p>
-      <w:r>
-        <w:t xml:space="preserve">Later that night, Buford and Clair asleep. Wes awake. </w:t>
+        <w:t xml:space="preserve">Some </w:t>
+      </w:r>
+      <w:proofErr w:type="gramStart"/>
+      <w:r>
+        <w:t>conversation</w:t>
+      </w:r>
+      <w:proofErr w:type="gramEnd"/>
+      <w:r>
+        <w:t xml:space="preserve"> here about Wes and Buford’s relationship. A reference to ‘the thing with the turkeys.’</w:t>
+      </w:r>
+    </w:p>
+    <w:p>
+      <w:r>
+        <w:t xml:space="preserve">Later that night, Buford and </w:t>
+      </w:r>
+      <w:proofErr w:type="gramStart"/>
+      <w:r>
+        <w:t>Clair</w:t>
+      </w:r>
+      <w:proofErr w:type="gramEnd"/>
+      <w:r>
+        <w:t xml:space="preserve"> asleep. Wes </w:t>
+      </w:r>
+      <w:proofErr w:type="gramStart"/>
+      <w:r>
+        <w:t>awake</w:t>
+      </w:r>
+      <w:proofErr w:type="gramEnd"/>
+      <w:r>
+        <w:t xml:space="preserve">. </w:t>
       </w:r>
     </w:p>
     <w:p/>
@@ -341,7 +439,15 @@
     <w:p>
       <w:r>
         <w:lastRenderedPageBreak/>
-        <w:t>Late that night, Buford and Clair lay asleep at the other end of the hall. Wesley lay awake, mesmerized before the screen. He had found at last the enchanted weapon he needed  was on the verge of conquering the great tusked creature under whose claws he had endured death after death.</w:t>
+        <w:t xml:space="preserve">Late that night, Buford and Clair lay asleep at the other end of the hall. Wesley lay awake, mesmerized before the screen. He had found at last the enchanted weapon he </w:t>
+      </w:r>
+      <w:proofErr w:type="gramStart"/>
+      <w:r>
+        <w:t>needed  was</w:t>
+      </w:r>
+      <w:proofErr w:type="gramEnd"/>
+      <w:r>
+        <w:t xml:space="preserve"> on the verge of conquering the great tusked creature under whose claws he had endured death after death.</w:t>
       </w:r>
     </w:p>
     <w:p>
@@ -371,7 +477,15 @@
     </w:p>
     <w:p>
       <w:r>
-        <w:t>“Oh, jeez. I’ve told you a thousand times ..”</w:t>
+        <w:t>“Oh, jeez. I’ve told you a thousand times</w:t>
+      </w:r>
+      <w:proofErr w:type="gramStart"/>
+      <w:r>
+        <w:t xml:space="preserve"> ..</w:t>
+      </w:r>
+      <w:proofErr w:type="gramEnd"/>
+      <w:r>
+        <w:t>”</w:t>
       </w:r>
     </w:p>
     <w:p>
@@ -382,12 +496,36 @@
         <w:t>are</w:t>
       </w:r>
       <w:r>
-        <w:t xml:space="preserve"> to their shoulders. They have long negs and almond shaped eyes. They’re in the orchard! Let’s go!”</w:t>
-      </w:r>
-    </w:p>
-    <w:p>
-      <w:r>
-        <w:t>The wire-crested pileated pea snipe were an invention of Mosey’s family going back generations. Nobody knows who invented them. Wesley had been dispatched in search of them when early in his childhood, as had Buford and each of his siblings. Mosey herself and perhaps even Mosey’s mother and beyond.</w:t>
+        <w:t xml:space="preserve"> to their shoulders. They have long </w:t>
+      </w:r>
+      <w:proofErr w:type="gramStart"/>
+      <w:r>
+        <w:t>negs</w:t>
+      </w:r>
+      <w:proofErr w:type="gramEnd"/>
+      <w:r>
+        <w:t xml:space="preserve"> and almond shaped eyes. They’re in the orchard! Let’s go!”</w:t>
+      </w:r>
+    </w:p>
+    <w:p>
+      <w:r>
+        <w:t xml:space="preserve">The wire-crested pileated pea snipe </w:t>
+      </w:r>
+      <w:proofErr w:type="gramStart"/>
+      <w:r>
+        <w:t>were</w:t>
+      </w:r>
+      <w:proofErr w:type="gramEnd"/>
+      <w:r>
+        <w:t xml:space="preserve"> an invention of Mosey’s family going back generations. Nobody knows who invented them. Wesley had been dispatched in search of </w:t>
+      </w:r>
+      <w:proofErr w:type="gramStart"/>
+      <w:r>
+        <w:t>them when</w:t>
+      </w:r>
+      <w:proofErr w:type="gramEnd"/>
+      <w:r>
+        <w:t xml:space="preserve"> early in his childhood, as had Buford and each of his siblings. Mosey herself and perhaps even Mosey’s mother and beyond.</w:t>
       </w:r>
     </w:p>
     <w:p>
@@ -413,23 +551,73 @@
     </w:p>
     <w:p>
       <w:r>
-        <w:t>There had been a period when Wes was younger when his dad had kept turkeys on the farm. A gentlemen farmer. They delighted all, including Wes. In those days, Wes enjoyed the farm. He was glad for the company of the animals and was glad they talked to him. The adults didn’t think it at all odd that he conversed with the animals and found it adorable that he did so and relayed information from the animals to the grown ups., translated the clucking of the hens into verse.</w:t>
-      </w:r>
-    </w:p>
-    <w:p>
-      <w:r>
-        <w:t>As he grew, the grown ups attitude switched from delight to concern. Wes was sent to Nashvanooga where he consulted with friendly strangers where they invited him to play with toys and draw pictures. Wes himself became uncomfortable not that he could converse with the animals but that others could not. He learned to discretion.</w:t>
-      </w:r>
-    </w:p>
-    <w:p>
-      <w:r>
-        <w:t>He did not give them names, except one. The smallest became known as Gretchen and was more curious than the rest and yada yada.</w:t>
+        <w:t xml:space="preserve">There had been a period when Wes was younger when his dad had kept turkeys on the farm. </w:t>
+      </w:r>
+      <w:proofErr w:type="gramStart"/>
+      <w:r>
+        <w:t>A gentlemen</w:t>
+      </w:r>
+      <w:proofErr w:type="gramEnd"/>
+      <w:r>
+        <w:t xml:space="preserve"> farmer. They delighted all, including Wes. In those days, Wes enjoyed the farm. He was glad for the company of the animals and was glad they talked to him. The adults didn’t think it at all odd that he conversed with the animals and found it adorable that he did so and relayed information from the animals to the </w:t>
+      </w:r>
+      <w:proofErr w:type="spellStart"/>
+      <w:proofErr w:type="gramStart"/>
+      <w:r>
+        <w:t>grown ups</w:t>
+      </w:r>
+      <w:proofErr w:type="spellEnd"/>
+      <w:proofErr w:type="gramEnd"/>
+      <w:r>
+        <w:t>., translated the clucking of the hens into verse.</w:t>
+      </w:r>
+    </w:p>
+    <w:p>
+      <w:r>
+        <w:t xml:space="preserve">As he grew, the </w:t>
+      </w:r>
+      <w:proofErr w:type="spellStart"/>
+      <w:r>
+        <w:t>grown ups</w:t>
+      </w:r>
+      <w:proofErr w:type="spellEnd"/>
+      <w:r>
+        <w:t xml:space="preserve"> attitude switched from delight to concern. Wes was sent to </w:t>
+      </w:r>
+      <w:proofErr w:type="spellStart"/>
+      <w:r>
+        <w:t>Nashvanooga</w:t>
+      </w:r>
+      <w:proofErr w:type="spellEnd"/>
+      <w:r>
+        <w:t xml:space="preserve"> where he consulted with friendly strangers where they invited him to play with toys and draw pictures. Wes himself became uncomfortable not that he could converse with the animals but that others could not. He learned to discretion.</w:t>
+      </w:r>
+    </w:p>
+    <w:p>
+      <w:r>
+        <w:t xml:space="preserve">He did not give them names, except one. The smallest became known as Gretchen and was more curious than the rest and yada </w:t>
+      </w:r>
+      <w:proofErr w:type="spellStart"/>
+      <w:r>
+        <w:t>yada</w:t>
+      </w:r>
+      <w:proofErr w:type="spellEnd"/>
+      <w:r>
+        <w:t>.</w:t>
       </w:r>
     </w:p>
     <w:p>
       <w:r>
         <w:lastRenderedPageBreak/>
-        <w:t>It came time to slaughter them. A bloody and violent business, but the gentleman farmer from the hobbiest. Wes was present on the farm and entrusted Beatrice to keep Wes occupied while the slaughter, a bloody and violent business, was competed.</w:t>
+        <w:t xml:space="preserve">It came time to slaughter them. A bloody and violent business, but the gentleman farmer from the </w:t>
+      </w:r>
+      <w:proofErr w:type="spellStart"/>
+      <w:r>
+        <w:t>hobbiest</w:t>
+      </w:r>
+      <w:proofErr w:type="spellEnd"/>
+      <w:r>
+        <w:t>. Wes was present on the farm and entrusted Beatrice to keep Wes occupied while the slaughter, a bloody and violent business, was competed.</w:t>
       </w:r>
     </w:p>
     <w:p>
@@ -457,12 +645,36 @@
     </w:p>
     <w:p>
       <w:r>
-        <w:t>But tonight, Wes was intrigued. Grimwalt had never reported actually seeing one, and given the mystery of the orchard, Wes was compelled. Wesley put on a pair of jeans and a flannel shirt. He crept down the stairs and silently exited the farmhouse under a bulbous orange full moon.</w:t>
-      </w:r>
-    </w:p>
-    <w:p>
-      <w:r>
-        <w:t xml:space="preserve">It uncommonly warm for an October night. </w:t>
+        <w:t xml:space="preserve">But tonight, Wes was intrigued. Grimwalt had never reported </w:t>
+      </w:r>
+      <w:proofErr w:type="gramStart"/>
+      <w:r>
+        <w:t>actually seeing</w:t>
+      </w:r>
+      <w:proofErr w:type="gramEnd"/>
+      <w:r>
+        <w:t xml:space="preserve"> one, and given the mystery of the orchard, Wes was compelled. Wesley put on a pair of jeans and a flannel shirt. He crept down the stairs and silently exited the farmhouse under a bulbous orange full moon.</w:t>
+      </w:r>
+    </w:p>
+    <w:p>
+      <w:r>
+        <w:t xml:space="preserve">It </w:t>
+      </w:r>
+      <w:proofErr w:type="gramStart"/>
+      <w:r>
+        <w:t>uncommonly</w:t>
+      </w:r>
+      <w:proofErr w:type="gramEnd"/>
+      <w:r>
+        <w:t xml:space="preserve"> </w:t>
+      </w:r>
+      <w:proofErr w:type="gramStart"/>
+      <w:r>
+        <w:t>warm</w:t>
+      </w:r>
+      <w:proofErr w:type="gramEnd"/>
+      <w:r>
+        <w:t xml:space="preserve"> for an October night. </w:t>
       </w:r>
     </w:p>
     <w:p>
@@ -519,23 +731,111 @@
     </w:p>
     <w:p>
       <w:r>
-        <w:t>Wes examined the area where Bandigo had been digging. He found in the dirt a roundish item that was about the size of a walnut but pale in color. Wes examined it. It appeared to be a sort of stemless mushroom. It’s gave a smell that was pungent and pleasing. It reminded Wes of bullion cubes and raisins. Wes could see how such a scent could send the dogs into a frenzy.</w:t>
+        <w:t xml:space="preserve">Wes examined the area where Bandigo had been digging. He found in the dirt a roundish item that was about the size of a walnut but pale in color. Wes examined it. It appeared to be a sort of stemless mushroom. </w:t>
+      </w:r>
+      <w:proofErr w:type="gramStart"/>
+      <w:r>
+        <w:t>It’s</w:t>
+      </w:r>
+      <w:proofErr w:type="gramEnd"/>
+      <w:r>
+        <w:t xml:space="preserve"> gave a smell that was pungent and pleasing. It reminded Wes of </w:t>
+      </w:r>
+      <w:proofErr w:type="spellStart"/>
+      <w:r>
+        <w:t>bullion</w:t>
+      </w:r>
+      <w:proofErr w:type="spellEnd"/>
+      <w:r>
+        <w:t xml:space="preserve"> cubes and raisins. Wes could see how such a scent could send the dogs into a frenzy.</w:t>
       </w:r>
     </w:p>
     <w:p/>
     <w:p>
       <w:r>
-        <w:t xml:space="preserve">Grimwalt continued to lark and cavort after imaginary birds. But then his excited yips turned into something else. Something aggressive. A much larger animal had appeared among them and a fight had broken out. </w:t>
-      </w:r>
-    </w:p>
-    <w:p>
-      <w:r>
-        <w:t>Though the full moon had lighted the meadow to a near daylight level, here in the shadow of the orchard it was difficult at first for Wes to see what was happening. Then he realized that the larger animal was Marnie’s pig, Ferdinand.</w:t>
-      </w:r>
-    </w:p>
-    <w:p>
-      <w:r>
-        <w:t>You might think of a pig as a comical animals, fat but fights between dogs and pigs are serious affairs. Amont some in these mountains, it is sport to set dogs on wild boars that roam in abundate and such encounters, usually go in the dog’s favor, who have advantage in number and the wild boars much smaller. But not always. Boars have fierce tusks and great strength in their necks and wild boar hunters tales of brave hounds lay entrails streaming. Ferdinand, an unnutered male, had formidable tusks and was much larger than the wild boars that roamed these mountains in the wild. Grimwalt was a dog past his prime. A Wonka Beast, he was, fierce and terrible.</w:t>
+        <w:t xml:space="preserve">Grimwalt continued to lark and cavort after imaginary birds. But then his excited yips turned into something else. Something aggressive. A much larger animal had appeared among </w:t>
+      </w:r>
+      <w:proofErr w:type="gramStart"/>
+      <w:r>
+        <w:t>them</w:t>
+      </w:r>
+      <w:proofErr w:type="gramEnd"/>
+      <w:r>
+        <w:t xml:space="preserve"> and a fight had broken out. </w:t>
+      </w:r>
+    </w:p>
+    <w:p>
+      <w:r>
+        <w:t xml:space="preserve">Though the full moon had </w:t>
+      </w:r>
+      <w:proofErr w:type="gramStart"/>
+      <w:r>
+        <w:t>lighted</w:t>
+      </w:r>
+      <w:proofErr w:type="gramEnd"/>
+      <w:r>
+        <w:t xml:space="preserve"> the meadow to a near daylight level, here in the shadow of the orchard it was difficult at first for Wes to see what was happening. Then he realized that the larger animal was Marnie’s pig, Ferdinand.</w:t>
+      </w:r>
+    </w:p>
+    <w:p>
+      <w:r>
+        <w:t xml:space="preserve">You might think of a pig as a </w:t>
+      </w:r>
+      <w:proofErr w:type="gramStart"/>
+      <w:r>
+        <w:t>comical animals</w:t>
+      </w:r>
+      <w:proofErr w:type="gramEnd"/>
+      <w:r>
+        <w:t xml:space="preserve">, fat but fights between dogs and pigs are serious affairs. Amont some in these mountains, it is </w:t>
+      </w:r>
+      <w:proofErr w:type="gramStart"/>
+      <w:r>
+        <w:t>sport</w:t>
+      </w:r>
+      <w:proofErr w:type="gramEnd"/>
+      <w:r>
+        <w:t xml:space="preserve"> to set dogs on wild boars that roam in </w:t>
+      </w:r>
+      <w:proofErr w:type="spellStart"/>
+      <w:r>
+        <w:t>abundate</w:t>
+      </w:r>
+      <w:proofErr w:type="spellEnd"/>
+      <w:r>
+        <w:t xml:space="preserve"> and such </w:t>
+      </w:r>
+      <w:proofErr w:type="gramStart"/>
+      <w:r>
+        <w:t>encounters,</w:t>
+      </w:r>
+      <w:proofErr w:type="gramEnd"/>
+      <w:r>
+        <w:t xml:space="preserve"> usually go in the dog’s favor, who have advantage in number and the wild boars much smaller. But not always. Boars have fierce tusks and great strength in their necks and wild boar </w:t>
+      </w:r>
+      <w:proofErr w:type="gramStart"/>
+      <w:r>
+        <w:t>hunters</w:t>
+      </w:r>
+      <w:proofErr w:type="gramEnd"/>
+      <w:r>
+        <w:t xml:space="preserve"> tales of brave hounds lay entrails streaming. Ferdinand, an </w:t>
+      </w:r>
+      <w:proofErr w:type="spellStart"/>
+      <w:r>
+        <w:t>unnutered</w:t>
+      </w:r>
+      <w:proofErr w:type="spellEnd"/>
+      <w:r>
+        <w:t xml:space="preserve"> male, had formidable tusks and was much larger than the wild boars that roamed these mountains in the wild. Grimwalt was a dog past his prime. A Wonka Beast, he </w:t>
+      </w:r>
+      <w:proofErr w:type="gramStart"/>
+      <w:r>
+        <w:t>was,</w:t>
+      </w:r>
+      <w:proofErr w:type="gramEnd"/>
+      <w:r>
+        <w:t xml:space="preserve"> fierce and terrible.</w:t>
       </w:r>
     </w:p>
     <w:p>
@@ -550,7 +850,15 @@
     </w:p>
     <w:p>
       <w:r>
-        <w:t>Fierce snarling. Guttural grunts. Gimwalt lay writhing and wailing on the ground.</w:t>
+        <w:t xml:space="preserve">Fierce snarling. Guttural grunts. </w:t>
+      </w:r>
+      <w:proofErr w:type="spellStart"/>
+      <w:r>
+        <w:t>Gimwalt</w:t>
+      </w:r>
+      <w:proofErr w:type="spellEnd"/>
+      <w:r>
+        <w:t xml:space="preserve"> lay writhing and wailing on the ground.</w:t>
       </w:r>
     </w:p>
     <w:p>
@@ -560,7 +868,15 @@
     </w:p>
     <w:p>
       <w:r>
-        <w:t>Wes turned to do just that. When he did, he ran square into Marnie. She carried a shovel and a large whicker basket.</w:t>
+        <w:t xml:space="preserve">Wes turned to do just that. When he did, he ran square into Marnie. She carried a shovel and a large </w:t>
+      </w:r>
+      <w:proofErr w:type="spellStart"/>
+      <w:r>
+        <w:t>whicker</w:t>
+      </w:r>
+      <w:proofErr w:type="spellEnd"/>
+      <w:r>
+        <w:t xml:space="preserve"> basket.</w:t>
       </w:r>
     </w:p>
     <w:p>
@@ -575,17 +891,49 @@
     </w:p>
     <w:p>
       <w:r>
-        <w:t>Marnie examined her pig and found him uninjured. Grimwalt was lucky in that the gash he received was in his shoulder and not his abdomen.</w:t>
-      </w:r>
-    </w:p>
-    <w:p>
-      <w:r>
-        <w:t>“This dog’ll be okay. He’ll need stitches. A lot of them. Go wake your dad.</w:t>
-      </w:r>
-    </w:p>
-    <w:p>
-      <w:r>
-        <w:t>“Wesley,” she said. “This orchard and what’s in it is mine. You stay out of it.”</w:t>
+        <w:t xml:space="preserve">Marnie examined her pig and found him uninjured. Grimwalt was </w:t>
+      </w:r>
+      <w:proofErr w:type="gramStart"/>
+      <w:r>
+        <w:t>lucky in</w:t>
+      </w:r>
+      <w:proofErr w:type="gramEnd"/>
+      <w:r>
+        <w:t xml:space="preserve"> that the gash he received was </w:t>
+      </w:r>
+      <w:proofErr w:type="gramStart"/>
+      <w:r>
+        <w:t>in</w:t>
+      </w:r>
+      <w:proofErr w:type="gramEnd"/>
+      <w:r>
+        <w:t xml:space="preserve"> his shoulder and not his abdomen.</w:t>
+      </w:r>
+    </w:p>
+    <w:p>
+      <w:r>
+        <w:t xml:space="preserve">“This </w:t>
+      </w:r>
+      <w:proofErr w:type="spellStart"/>
+      <w:r>
+        <w:t>dog’ll</w:t>
+      </w:r>
+      <w:proofErr w:type="spellEnd"/>
+      <w:r>
+        <w:t xml:space="preserve"> be okay. He’ll need stitches. A lot of them. Go wake your dad.</w:t>
+      </w:r>
+    </w:p>
+    <w:p>
+      <w:r>
+        <w:t xml:space="preserve">“Wesley,” she said. “This orchard and what’s in it </w:t>
+      </w:r>
+      <w:proofErr w:type="gramStart"/>
+      <w:r>
+        <w:t>is</w:t>
+      </w:r>
+      <w:proofErr w:type="gramEnd"/>
+      <w:r>
+        <w:t xml:space="preserve"> mine. You stay out of it.”</w:t>
       </w:r>
     </w:p>
     <w:p/>
@@ -607,12 +955,36 @@
     </w:p>
     <w:p>
       <w:r>
-        <w:t xml:space="preserve">“Up to her toil and troubling, I guess. Up there scrounging for  bat toungues and frog toes. </w:t>
-      </w:r>
-    </w:p>
-    <w:p>
-      <w:r>
-        <w:t xml:space="preserve">For the next two nights, the dogs saw the could see the wire crested pea snipes along the edge of the forest and were consumed with a desire to pursue them. They could smell Marnie and Ferdinand in the orchard as well. After two nights, the full moon waned and the wire-crested pea snipe were </w:t>
+        <w:t xml:space="preserve">“Up to her toil and troubling, I guess. Up there scrounging </w:t>
+      </w:r>
+      <w:proofErr w:type="gramStart"/>
+      <w:r>
+        <w:t>for  bat</w:t>
+      </w:r>
+      <w:proofErr w:type="gramEnd"/>
+      <w:r>
+        <w:t xml:space="preserve"> </w:t>
+      </w:r>
+      <w:proofErr w:type="spellStart"/>
+      <w:r>
+        <w:t>toungues</w:t>
+      </w:r>
+      <w:proofErr w:type="spellEnd"/>
+      <w:r>
+        <w:t xml:space="preserve"> and frog toes. </w:t>
+      </w:r>
+    </w:p>
+    <w:p>
+      <w:r>
+        <w:t xml:space="preserve">For the next two nights, the dogs saw </w:t>
+      </w:r>
+      <w:proofErr w:type="gramStart"/>
+      <w:r>
+        <w:t>the</w:t>
+      </w:r>
+      <w:proofErr w:type="gramEnd"/>
+      <w:r>
+        <w:t xml:space="preserve"> could see the wire crested pea snipes along the edge of the forest and were consumed with a desire to pursue them. They could smell Marnie and Ferdinand in the orchard as well. After two nights, the full moon waned and the wire-crested pea snipe were </w:t>
       </w:r>
       <w:r>
         <w:t>gone</w:t>

</xml_diff>